<commit_message>
Phase 6: validated heatmaps, fix shape-change shortcut, retrain, refresh demo and docs
</commit_message>
<xml_diff>
--- a/docs/Counterfeit_Medicine_Project_Progress.docx
+++ b/docs/Counterfeit_Medicine_Project_Progress.docx
@@ -80,10 +80,10 @@
           <w:b/>
           <w:bCs/>
         </w:rPr>
-        <w:t xml:space="preserve">81% of the fakes</w:t>
-      </w:r>
-      <w:r>
-        <w:t xml:space="preserve"> it is shown and wrongly accuses very few genuine items. A small demo web page lets you try it live. The part that writes every decision into a tamper-proof blockchain record is </w:t>
+        <w:t xml:space="preserve">85% of the fakes</w:t>
+      </w:r>
+      <w:r>
+        <w:t xml:space="preserve"> it is shown, at the price of some false alarms (roughly 1 genuine item in 6 is wrongly flagged). A small demo web page lets you try it live. The part that writes every decision into a tamper-proof blockchain record is </w:t>
       </w:r>
       <w:r>
         <w:rPr>
@@ -822,7 +822,7 @@
                 <w:sz w:val="20"/>
                 <w:szCs w:val="20"/>
               </w:rPr>
-              <w:t xml:space="preserve">Done (works, but recall 0.81 is below our 0.90 goal)</w:t>
+              <w:t xml:space="preserve">Done (works, but fakes caught is 85%, below our 90% goal)</w:t>
             </w:r>
           </w:p>
         </w:tc>
@@ -1014,7 +1014,7 @@
                 <w:sz w:val="20"/>
                 <w:szCs w:val="20"/>
               </w:rPr>
-              <w:t xml:space="preserve">Partly (heatmap works; the proper accuracy check of the heatmaps is not done)</w:t>
+              <w:t xml:space="preserve">Partly (heatmaps work and were checked against the real edits; the SHAP/LIME comparison is still to do)</w:t>
             </w:r>
           </w:p>
         </w:tc>
@@ -3533,7 +3533,7 @@
         <w:spacing w:after="120" w:line="276"/>
       </w:pPr>
       <w:r>
-        <w:t xml:space="preserve">Bigger images helped a lot because many edits are tiny; we picked C because the plan values catching fakes most.</w:t>
+        <w:t xml:space="preserve">Bigger images helped a lot because many edits are tiny; we picked C because the plan values catching fakes most. These tuning runs happened before the shortcut fix in section 4.10; the final model was retrained on the fixed data with the same recipe.</w:t>
       </w:r>
     </w:p>
     <w:p>
@@ -3581,7 +3581,7 @@
         <w:t xml:space="preserve">Simple baseline:</w:t>
       </w:r>
       <w:r>
-        <w:t xml:space="preserve"> a trivial method (just looking at colour counts) scored AUC 0.60. Our model scored 0.91, so it is genuinely learning something.</w:t>
+        <w:t xml:space="preserve"> a trivial method (just looking at colour counts) scored AUC 0.61. Our model scored 0.90, so it is genuinely learning something.</w:t>
       </w:r>
     </w:p>
     <w:p>
@@ -3601,7 +3601,7 @@
         <w:t xml:space="preserve">Shortcut check:</w:t>
       </w:r>
       <w:r>
-        <w:t xml:space="preserve"> can file size or image dimensions alone tell genuine from fake? No (0.50, which is a coin flip), so the model is not cheating on technical details.</w:t>
+        <w:t xml:space="preserve"> can file size or image dimensions alone tell genuine from fake? No (0.51, which is a coin flip), so the model is not cheating on technical details.</w:t>
       </w:r>
     </w:p>
     <w:p>
@@ -3852,7 +3852,7 @@
                 <w:sz w:val="20"/>
                 <w:szCs w:val="20"/>
               </w:rPr>
-              <w:t xml:space="preserve">88.3%</w:t>
+              <w:t xml:space="preserve">83.6%</w:t>
             </w:r>
           </w:p>
         </w:tc>
@@ -3883,7 +3883,7 @@
                 <w:sz w:val="20"/>
                 <w:szCs w:val="20"/>
               </w:rPr>
-              <w:t xml:space="preserve">Out of every 100 test images, about 88 were judged correctly.</w:t>
+              <w:t xml:space="preserve">Out of every 100 test images, about 84 were judged correctly.</w:t>
             </w:r>
           </w:p>
         </w:tc>
@@ -3947,7 +3947,7 @@
                 <w:sz w:val="20"/>
                 <w:szCs w:val="20"/>
               </w:rPr>
-              <w:t xml:space="preserve">81.2%  (goal 90%)</w:t>
+              <w:t xml:space="preserve">84.6%  (goal 90%)</w:t>
             </w:r>
           </w:p>
         </w:tc>
@@ -3978,7 +3978,7 @@
                 <w:sz w:val="20"/>
                 <w:szCs w:val="20"/>
               </w:rPr>
-              <w:t xml:space="preserve">Of 100 fakes, about 81 were caught. </w:t>
+              <w:t xml:space="preserve">Of 100 fakes, about 85 were caught. </w:t>
             </w:r>
             <w:r>
               <w:rPr>
@@ -4051,7 +4051,7 @@
                 <w:sz w:val="20"/>
                 <w:szCs w:val="20"/>
               </w:rPr>
-              <w:t xml:space="preserve">94.5%</w:t>
+              <w:t xml:space="preserve">82.9%</w:t>
             </w:r>
           </w:p>
         </w:tc>
@@ -4082,7 +4082,7 @@
                 <w:sz w:val="20"/>
                 <w:szCs w:val="20"/>
               </w:rPr>
-              <w:t xml:space="preserve">When it says fake, it is right about 19 times out of 20.</w:t>
+              <w:t xml:space="preserve">When it says fake, it is right about 5 times out of 6.</w:t>
             </w:r>
           </w:p>
         </w:tc>
@@ -4146,7 +4146,7 @@
                 <w:sz w:val="20"/>
                 <w:szCs w:val="20"/>
               </w:rPr>
-              <w:t xml:space="preserve">95.3%</w:t>
+              <w:t xml:space="preserve">82.6%</w:t>
             </w:r>
           </w:p>
         </w:tc>
@@ -4177,7 +4177,7 @@
                 <w:sz w:val="20"/>
                 <w:szCs w:val="20"/>
               </w:rPr>
-              <w:t xml:space="preserve">Only about 5 in 100 genuine items were wrongly called fake.</w:t>
+              <w:t xml:space="preserve">About 17 in 100 genuine items were wrongly called fake.</w:t>
             </w:r>
           </w:p>
         </w:tc>
@@ -4241,7 +4241,7 @@
                 <w:sz w:val="20"/>
                 <w:szCs w:val="20"/>
               </w:rPr>
-              <w:t xml:space="preserve">0.909</w:t>
+              <w:t xml:space="preserve">0.904</w:t>
             </w:r>
           </w:p>
         </w:tc>
@@ -4357,17 +4357,17 @@
         <w:t xml:space="preserve">Where it is strong and weak</w:t>
       </w:r>
       <w:r>
-        <w:t xml:space="preserve"> (share of fakes caught): noise 100%, wrong text 92%, shape change 89%, imprint blur 84%, and </w:t>
+        <w:t xml:space="preserve"> (share of fakes caught): noise 100%, wrong text 96%, shape change 90%, imprint blur 88%, and </w:t>
       </w:r>
       <w:r>
         <w:rPr>
           <w:b/>
           <w:bCs/>
         </w:rPr>
-        <w:t xml:space="preserve">colour shift only 71%</w:t>
-      </w:r>
-      <w:r>
-        <w:t xml:space="preserve">. By strength: low 71%, medium 83%, high 91%. Edits to one area (87%) are caught more often than whole-image edits (70%). Boxes (82%) and pills (80%) are about equal. In short, the subtle fakes are the hard ones, which is exactly what you would expect.</w:t>
+        <w:t xml:space="preserve">colour shift only 78%</w:t>
+      </w:r>
+      <w:r>
+        <w:t xml:space="preserve">. By strength: low 82%, medium 85%, high 87%. Edits to one area (91%) are caught more often than whole-image edits (74%). Pills (86%) and boxes (84%) are about equal. In short, the subtle fakes are the hard ones, which is exactly what you would expect.</w:t>
       </w:r>
     </w:p>
     <w:p>
@@ -4408,7 +4408,7 @@
         <w:t xml:space="preserve">Honest finding:</w:t>
       </w:r>
       <w:r>
-        <w:t xml:space="preserve"> it carries some signal on its own (AUC 0.79), but combining it with the main model only nudged AUC from 0.897 to 0.907 and fakes caught from 80% to 82%, while false alarms rose from 8% to 13%. So it is a weak helper, not a game-changer. We report that as it is. Note it works only for loose pills of those 23 drugs.</w:t>
+        <w:t xml:space="preserve"> it carries some signal on its own (AUC 0.79), but combining it with the main model only nudged AUC from 0.903 to 0.910 and fakes caught from 80% to 82%, while false alarms rose from 8% to 9%. So it is a weak helper, not a game-changer. We report that as it is. Note it works only for loose pills of those 23 drugs.</w:t>
       </w:r>
     </w:p>
     <w:p>
@@ -4453,7 +4453,7 @@
           <w:b/>
           <w:bCs/>
         </w:rPr>
-        <w:t xml:space="preserve">63%</w:t>
+        <w:t xml:space="preserve">51%</w:t>
       </w:r>
       <w:r>
         <w:t xml:space="preserve"> automatically and was right on </w:t>
@@ -4463,7 +4463,7 @@
           <w:b/>
           <w:bCs/>
         </w:rPr>
-        <w:t xml:space="preserve">93.6%</w:t>
+        <w:t xml:space="preserve">94.8%</w:t>
       </w:r>
       <w:r>
         <w:t xml:space="preserve"> of those.</w:t>
@@ -4486,7 +4486,7 @@
           <w:b/>
           <w:bCs/>
         </w:rPr>
-        <w:t xml:space="preserve">11</w:t>
+        <w:t xml:space="preserve">7</w:t>
       </w:r>
       <w:r>
         <w:t xml:space="preserve"> fakes (approved them by mistake) and wrongly flagged </w:t>
@@ -4512,7 +4512,7 @@
         <w:spacing w:after="60" w:line="276"/>
       </w:pPr>
       <w:r>
-        <w:t xml:space="preserve">It escalated 110 images to a human: 82 genuine and 28 fake. Uncertain cases are the point of escalation.</w:t>
+        <w:t xml:space="preserve">It escalated 145 images to a human: 107 genuine and 38 fake. Uncertain cases are the point of escalation.</w:t>
       </w:r>
     </w:p>
     <w:p>
@@ -4528,22 +4528,185 @@
         <w:pStyle w:val="Heading2"/>
       </w:pPr>
       <w:r>
-        <w:t xml:space="preserve">4.9 The heatmap and the demo page</w:t>
+        <w:t xml:space="preserve">4.9 The heatmaps and the demo page</w:t>
       </w:r>
     </w:p>
     <w:p>
       <w:pPr>
         <w:spacing w:after="120" w:line="276"/>
       </w:pPr>
+      <w:r>
+        <w:t xml:space="preserve">A </w:t>
+      </w:r>
       <w:r>
         <w:rPr>
           <w:b/>
           <w:bCs/>
         </w:rPr>
-        <w:t xml:space="preserve">Grad-CAM</w:t>
-      </w:r>
-      <w:r>
-        <w:t xml:space="preserve"> looks at which areas of the photo pushed the model toward "counterfeit" and paints them warm colours. It takes about a tenth of a second. It is a hint about the model's attention, not proof that the medicine is fake, and we have not yet measured how well the warm areas match the real edited area (that is the remaining part of Phase 6).</w:t>
+        <w:t xml:space="preserve">heatmap</w:t>
+      </w:r>
+      <w:r>
+        <w:t xml:space="preserve"> (the Grad-CAM family) paints in warm colours the parts of the photo that pushed the model toward "counterfeit". Red or yellow means strong evidence, blue means little. It takes about a tenth of a second. It is a hint about the model's attention, not proof that a medicine is fake.</w:t>
+      </w:r>
+    </w:p>
+    <w:p>
+      <w:pPr>
+        <w:spacing w:after="120" w:line="276"/>
+      </w:pPr>
+      <w:r>
+        <w:t xml:space="preserve">You asked that the heatmap really works, so we measured it instead of trusting it. On the 95 test fakes where we know exactly where the edit was made, we asked: does the heatmap light up that spot? We also tried several heatmap methods and layers and picked the best on the validation images only (LayerCAM on an earlier layer, which is sharper than the default).</w:t>
+      </w:r>
+    </w:p>
+    <w:p>
+      <w:pPr>
+        <w:pStyle w:val="ListParagraph"/>
+        <w:numPr>
+          <w:ilvl w:val="0"/>
+          <w:numId w:val="2"/>
+        </w:numPr>
+        <w:spacing w:after="60" w:line="276"/>
+      </w:pPr>
+      <w:r>
+        <w:t xml:space="preserve">The single hottest point lands </w:t>
+      </w:r>
+      <w:r>
+        <w:rPr>
+          <w:b/>
+          <w:bCs/>
+        </w:rPr>
+        <w:t xml:space="preserve">inside the real edit 66% of the time</w:t>
+      </w:r>
+      <w:r>
+        <w:t xml:space="preserve"> (77% for strong edits, 59% for subtle ones).</w:t>
+      </w:r>
+    </w:p>
+    <w:p>
+      <w:pPr>
+        <w:pStyle w:val="ListParagraph"/>
+        <w:numPr>
+          <w:ilvl w:val="0"/>
+          <w:numId w:val="2"/>
+        </w:numPr>
+        <w:spacing w:after="60" w:line="276"/>
+      </w:pPr>
+      <w:r>
+        <w:t xml:space="preserve">It puts </w:t>
+      </w:r>
+      <w:r>
+        <w:rPr>
+          <w:b/>
+          <w:bCs/>
+        </w:rPr>
+        <w:t xml:space="preserve">9 times more attention on the edited area</w:t>
+      </w:r>
+      <w:r>
+        <w:t xml:space="preserve"> than chance would.</w:t>
+      </w:r>
+    </w:p>
+    <w:p>
+      <w:pPr>
+        <w:pStyle w:val="ListParagraph"/>
+        <w:numPr>
+          <w:ilvl w:val="0"/>
+          <w:numId w:val="2"/>
+        </w:numPr>
+        <w:spacing w:after="60" w:line="276"/>
+      </w:pPr>
+      <w:r>
+        <w:t xml:space="preserve">Control: on the genuine twin of the same photo, the hottest point lands in that same spot only 23% of the time, so the heatmap is reacting to the fake edit and not just to the pill.</w:t>
+      </w:r>
+    </w:p>
+    <w:p>
+      <w:pPr>
+        <w:pStyle w:val="ListParagraph"/>
+        <w:numPr>
+          <w:ilvl w:val="0"/>
+          <w:numId w:val="2"/>
+        </w:numPr>
+        <w:spacing w:after="60" w:line="276"/>
+      </w:pPr>
+      <w:r>
+        <w:t xml:space="preserve">It is </w:t>
+      </w:r>
+      <w:r>
+        <w:rPr>
+          <w:b/>
+          <w:bCs/>
+        </w:rPr>
+        <w:t xml:space="preserve">not</w:t>
+      </w:r>
+      <w:r>
+        <w:t xml:space="preserve"> staring at black borders any more (attention on black pixels is about neutral, 1.05 where 1.0 is neutral).</w:t>
+      </w:r>
+    </w:p>
+    <w:p>
+      <w:pPr>
+        <w:spacing w:after="40" w:before="120"/>
+        <w:jc w:val="center"/>
+      </w:pPr>
+      <w:r>
+        <w:drawing>
+          <wp:inline distT="0" distB="0" distL="0" distR="0">
+            <wp:extent cx="2857500" cy="5553075"/>
+            <wp:effectExtent t="0" r="0" b="0" l="0"/>
+            <wp:docPr id="3" name="Figure 3: heatmaps on test images. Top to bottom: fake caught, genuine passed, genuine flagged by mistake, fake missed. Green box = where the edit really was." descr="Figure 3: heatmaps on test images. Top to bottom: fake caught, genuine passed, genuine flagged by mistake, fake missed. Green box = where the edit really was." title="Figure 3: heatmaps on test images. Top to bottom: fake caught, genuine passed, genuine flagged by mistake, fake missed. Green box = where the edit really was."/>
+            <wp:cNvGraphicFramePr>
+              <a:graphicFrameLocks xmlns:a="http://schemas.openxmlformats.org/drawingml/2006/main" noChangeAspect="1"/>
+            </wp:cNvGraphicFramePr>
+            <a:graphic xmlns:a="http://schemas.openxmlformats.org/drawingml/2006/main">
+              <a:graphicData uri="http://schemas.openxmlformats.org/drawingml/2006/picture">
+                <pic:pic xmlns:pic="http://schemas.openxmlformats.org/drawingml/2006/picture">
+                  <pic:nvPicPr>
+                    <pic:cNvPr id="0" name="" descr=""/>
+                    <pic:cNvPicPr>
+                      <a:picLocks noChangeAspect="1" noChangeArrowheads="1"/>
+                    </pic:cNvPicPr>
+                  </pic:nvPicPr>
+                  <pic:blipFill>
+                    <a:blip r:embed="rId11" cstate="none"/>
+                    <a:srcRect/>
+                    <a:stretch>
+                      <a:fillRect/>
+                    </a:stretch>
+                  </pic:blipFill>
+                  <pic:spPr bwMode="auto">
+                    <a:xfrm>
+                      <a:off x="0" y="0"/>
+                      <a:ext cx="2857500" cy="5553075"/>
+                    </a:xfrm>
+                    <a:prstGeom prst="rect">
+                      <a:avLst/>
+                    </a:prstGeom>
+                  </pic:spPr>
+                </pic:pic>
+              </a:graphicData>
+            </a:graphic>
+          </wp:inline>
+        </w:drawing>
+      </w:r>
+    </w:p>
+    <w:p>
+      <w:pPr>
+        <w:spacing w:after="160"/>
+        <w:jc w:val="center"/>
+      </w:pPr>
+      <w:r>
+        <w:rPr>
+          <w:i/>
+          <w:iCs/>
+          <w:color w:val="595959"/>
+          <w:sz w:val="19"/>
+          <w:szCs w:val="19"/>
+        </w:rPr>
+        <w:t xml:space="preserve">Figure 3: heatmaps on test images. Top to bottom: fake caught, genuine passed, genuine flagged by mistake, fake missed. Green box = where the edit really was.</w:t>
+      </w:r>
+    </w:p>
+    <w:p>
+      <w:pPr>
+        <w:spacing w:after="120" w:line="276"/>
+      </w:pPr>
+      <w:r>
+        <w:t xml:space="preserve">Honest limits: the heatmap only matches the edit where the edit is local (colour shifts and noise affect the whole photo, so there is no spot to find); on the false alarms and misses the heatmap shows the model looking at the wrong thing, which is useful for debugging; and we have not yet compared it with LIME or SHAP.</w:t>
       </w:r>
     </w:p>
     <w:p>
@@ -4594,6 +4757,740 @@
       </w:r>
       <w:r>
         <w:t xml:space="preserve"> (an honest checklist). It says clearly that nothing is written to a blockchain yet.</w:t>
+      </w:r>
+    </w:p>
+    <w:p>
+      <w:pPr>
+        <w:pStyle w:val="Heading2"/>
+      </w:pPr>
+      <w:r>
+        <w:t xml:space="preserve">4.10 A shortcut we found and fixed</w:t>
+      </w:r>
+    </w:p>
+    <w:p>
+      <w:pPr>
+        <w:spacing w:after="120" w:line="276"/>
+      </w:pPr>
+      <w:r>
+        <w:t xml:space="preserve">When you opened the demo, one heatmap was red along the bottom edge of the photo and blue over the pill. That told us the model was not looking at the medicine. The cause was my fake generator: the "shape change" edit warps the photo and leaves a black wedge at the border, and the model had learned that a black wedge means fake. This is called </w:t>
+      </w:r>
+      <w:r>
+        <w:rPr>
+          <w:b/>
+          <w:bCs/>
+        </w:rPr>
+        <w:t xml:space="preserve">shortcut learning</w:t>
+      </w:r>
+      <w:r>
+        <w:t xml:space="preserve">: the model passes the exam by spotting a side-effect of how the test was made, not the thing we care about.</w:t>
+      </w:r>
+    </w:p>
+    <w:p>
+      <w:pPr>
+        <w:spacing w:after="120" w:line="276"/>
+      </w:pPr>
+      <w:r>
+        <w:t xml:space="preserve">We measured it (attention on black pixels was higher for shape-change fakes) and fixed it: the warp now fills those corners with mirrored image content, so there is no black wedge and the amount of black in a fake matches its genuine twin (a first fix that zoomed in cropped away the photo's own black bars and created a different cue, so we dropped it). Then we retrained on the fixed data with the same recipe. Before and after, on the same 298 test images:</w:t>
+      </w:r>
+    </w:p>
+    <w:tbl>
+      <w:tblPr>
+        <w:tblW w:type="dxa" w:w="9638"/>
+        <w:tblBorders>
+          <w:top w:val="single" w:color="auto" w:sz="4"/>
+          <w:left w:val="single" w:color="auto" w:sz="4"/>
+          <w:bottom w:val="single" w:color="auto" w:sz="4"/>
+          <w:right w:val="single" w:color="auto" w:sz="4"/>
+          <w:insideH w:val="single" w:color="auto" w:sz="4"/>
+          <w:insideV w:val="single" w:color="auto" w:sz="4"/>
+        </w:tblBorders>
+      </w:tblPr>
+      <w:tblGrid>
+        <w:gridCol w:w="4000"/>
+        <w:gridCol w:w="2700"/>
+        <w:gridCol w:w="2938"/>
+      </w:tblGrid>
+      <w:tr>
+        <w:trPr>
+          <w:tblHeader/>
+        </w:trPr>
+        <w:tc>
+          <w:tcPr>
+            <w:tcW w:type="dxa" w:w="4000"/>
+            <w:tcBorders>
+              <w:top w:val="single" w:color="BFBFBF" w:sz="4"/>
+              <w:left w:val="single" w:color="BFBFBF" w:sz="4"/>
+              <w:bottom w:val="single" w:color="BFBFBF" w:sz="4"/>
+              <w:right w:val="single" w:color="BFBFBF" w:sz="4"/>
+            </w:tcBorders>
+            <w:shd w:fill="1F3864" w:val="clear"/>
+            <w:tcMar>
+              <w:top w:type="dxa" w:w="70"/>
+              <w:left w:type="dxa" w:w="110"/>
+              <w:bottom w:type="dxa" w:w="70"/>
+              <w:right w:type="dxa" w:w="110"/>
+            </w:tcMar>
+          </w:tcPr>
+          <w:p>
+            <w:pPr>
+              <w:spacing w:after="0" w:line="252"/>
+            </w:pPr>
+            <w:r>
+              <w:rPr>
+                <w:b/>
+                <w:bCs/>
+                <w:color w:val="FFFFFF"/>
+                <w:sz w:val="20"/>
+                <w:szCs w:val="20"/>
+              </w:rPr>
+              <w:t xml:space="preserve">Measure</w:t>
+            </w:r>
+          </w:p>
+        </w:tc>
+        <w:tc>
+          <w:tcPr>
+            <w:tcW w:type="dxa" w:w="2700"/>
+            <w:tcBorders>
+              <w:top w:val="single" w:color="BFBFBF" w:sz="4"/>
+              <w:left w:val="single" w:color="BFBFBF" w:sz="4"/>
+              <w:bottom w:val="single" w:color="BFBFBF" w:sz="4"/>
+              <w:right w:val="single" w:color="BFBFBF" w:sz="4"/>
+            </w:tcBorders>
+            <w:shd w:fill="1F3864" w:val="clear"/>
+            <w:tcMar>
+              <w:top w:type="dxa" w:w="70"/>
+              <w:left w:type="dxa" w:w="110"/>
+              <w:bottom w:type="dxa" w:w="70"/>
+              <w:right w:type="dxa" w:w="110"/>
+            </w:tcMar>
+          </w:tcPr>
+          <w:p>
+            <w:pPr>
+              <w:spacing w:after="0" w:line="252"/>
+            </w:pPr>
+            <w:r>
+              <w:rPr>
+                <w:b/>
+                <w:bCs/>
+                <w:color w:val="FFFFFF"/>
+                <w:sz w:val="20"/>
+                <w:szCs w:val="20"/>
+              </w:rPr>
+              <w:t xml:space="preserve">Before the fix</w:t>
+            </w:r>
+          </w:p>
+        </w:tc>
+        <w:tc>
+          <w:tcPr>
+            <w:tcW w:type="dxa" w:w="2938"/>
+            <w:tcBorders>
+              <w:top w:val="single" w:color="BFBFBF" w:sz="4"/>
+              <w:left w:val="single" w:color="BFBFBF" w:sz="4"/>
+              <w:bottom w:val="single" w:color="BFBFBF" w:sz="4"/>
+              <w:right w:val="single" w:color="BFBFBF" w:sz="4"/>
+            </w:tcBorders>
+            <w:shd w:fill="1F3864" w:val="clear"/>
+            <w:tcMar>
+              <w:top w:type="dxa" w:w="70"/>
+              <w:left w:type="dxa" w:w="110"/>
+              <w:bottom w:type="dxa" w:w="70"/>
+              <w:right w:type="dxa" w:w="110"/>
+            </w:tcMar>
+          </w:tcPr>
+          <w:p>
+            <w:pPr>
+              <w:spacing w:after="0" w:line="252"/>
+            </w:pPr>
+            <w:r>
+              <w:rPr>
+                <w:b/>
+                <w:bCs/>
+                <w:color w:val="FFFFFF"/>
+                <w:sz w:val="20"/>
+                <w:szCs w:val="20"/>
+              </w:rPr>
+              <w:t xml:space="preserve">After the fix</w:t>
+            </w:r>
+          </w:p>
+        </w:tc>
+      </w:tr>
+      <w:tr>
+        <w:tc>
+          <w:tcPr>
+            <w:tcW w:type="dxa" w:w="4000"/>
+            <w:tcBorders>
+              <w:top w:val="single" w:color="BFBFBF" w:sz="4"/>
+              <w:left w:val="single" w:color="BFBFBF" w:sz="4"/>
+              <w:bottom w:val="single" w:color="BFBFBF" w:sz="4"/>
+              <w:right w:val="single" w:color="BFBFBF" w:sz="4"/>
+            </w:tcBorders>
+            <w:tcMar>
+              <w:top w:type="dxa" w:w="70"/>
+              <w:left w:type="dxa" w:w="110"/>
+              <w:bottom w:type="dxa" w:w="70"/>
+              <w:right w:type="dxa" w:w="110"/>
+            </w:tcMar>
+          </w:tcPr>
+          <w:p>
+            <w:pPr>
+              <w:spacing w:after="0" w:line="252"/>
+            </w:pPr>
+            <w:r>
+              <w:rPr>
+                <w:b w:val="false"/>
+                <w:bCs w:val="false"/>
+                <w:sz w:val="20"/>
+                <w:szCs w:val="20"/>
+              </w:rPr>
+              <w:t xml:space="preserve">Fakes caught (recall)</w:t>
+            </w:r>
+          </w:p>
+        </w:tc>
+        <w:tc>
+          <w:tcPr>
+            <w:tcW w:type="dxa" w:w="2700"/>
+            <w:tcBorders>
+              <w:top w:val="single" w:color="BFBFBF" w:sz="4"/>
+              <w:left w:val="single" w:color="BFBFBF" w:sz="4"/>
+              <w:bottom w:val="single" w:color="BFBFBF" w:sz="4"/>
+              <w:right w:val="single" w:color="BFBFBF" w:sz="4"/>
+            </w:tcBorders>
+            <w:tcMar>
+              <w:top w:type="dxa" w:w="70"/>
+              <w:left w:type="dxa" w:w="110"/>
+              <w:bottom w:type="dxa" w:w="70"/>
+              <w:right w:type="dxa" w:w="110"/>
+            </w:tcMar>
+          </w:tcPr>
+          <w:p>
+            <w:pPr>
+              <w:spacing w:after="0" w:line="252"/>
+            </w:pPr>
+            <w:r>
+              <w:rPr>
+                <w:b w:val="false"/>
+                <w:bCs w:val="false"/>
+                <w:sz w:val="20"/>
+                <w:szCs w:val="20"/>
+              </w:rPr>
+              <w:t xml:space="preserve">81.2%</w:t>
+            </w:r>
+          </w:p>
+        </w:tc>
+        <w:tc>
+          <w:tcPr>
+            <w:tcW w:type="dxa" w:w="2938"/>
+            <w:tcBorders>
+              <w:top w:val="single" w:color="BFBFBF" w:sz="4"/>
+              <w:left w:val="single" w:color="BFBFBF" w:sz="4"/>
+              <w:bottom w:val="single" w:color="BFBFBF" w:sz="4"/>
+              <w:right w:val="single" w:color="BFBFBF" w:sz="4"/>
+            </w:tcBorders>
+            <w:tcMar>
+              <w:top w:type="dxa" w:w="70"/>
+              <w:left w:type="dxa" w:w="110"/>
+              <w:bottom w:type="dxa" w:w="70"/>
+              <w:right w:type="dxa" w:w="110"/>
+            </w:tcMar>
+          </w:tcPr>
+          <w:p>
+            <w:pPr>
+              <w:spacing w:after="0" w:line="252"/>
+            </w:pPr>
+            <w:r>
+              <w:rPr>
+                <w:b w:val="false"/>
+                <w:bCs w:val="false"/>
+                <w:sz w:val="20"/>
+                <w:szCs w:val="20"/>
+              </w:rPr>
+              <w:t xml:space="preserve">84.6%</w:t>
+            </w:r>
+          </w:p>
+        </w:tc>
+      </w:tr>
+      <w:tr>
+        <w:tc>
+          <w:tcPr>
+            <w:tcW w:type="dxa" w:w="4000"/>
+            <w:tcBorders>
+              <w:top w:val="single" w:color="BFBFBF" w:sz="4"/>
+              <w:left w:val="single" w:color="BFBFBF" w:sz="4"/>
+              <w:bottom w:val="single" w:color="BFBFBF" w:sz="4"/>
+              <w:right w:val="single" w:color="BFBFBF" w:sz="4"/>
+            </w:tcBorders>
+            <w:tcMar>
+              <w:top w:type="dxa" w:w="70"/>
+              <w:left w:type="dxa" w:w="110"/>
+              <w:bottom w:type="dxa" w:w="70"/>
+              <w:right w:type="dxa" w:w="110"/>
+            </w:tcMar>
+          </w:tcPr>
+          <w:p>
+            <w:pPr>
+              <w:spacing w:after="0" w:line="252"/>
+            </w:pPr>
+            <w:r>
+              <w:rPr>
+                <w:b w:val="false"/>
+                <w:bCs w:val="false"/>
+                <w:sz w:val="20"/>
+                <w:szCs w:val="20"/>
+              </w:rPr>
+              <w:t xml:space="preserve">When it says fake, it is right</w:t>
+            </w:r>
+          </w:p>
+        </w:tc>
+        <w:tc>
+          <w:tcPr>
+            <w:tcW w:type="dxa" w:w="2700"/>
+            <w:tcBorders>
+              <w:top w:val="single" w:color="BFBFBF" w:sz="4"/>
+              <w:left w:val="single" w:color="BFBFBF" w:sz="4"/>
+              <w:bottom w:val="single" w:color="BFBFBF" w:sz="4"/>
+              <w:right w:val="single" w:color="BFBFBF" w:sz="4"/>
+            </w:tcBorders>
+            <w:tcMar>
+              <w:top w:type="dxa" w:w="70"/>
+              <w:left w:type="dxa" w:w="110"/>
+              <w:bottom w:type="dxa" w:w="70"/>
+              <w:right w:type="dxa" w:w="110"/>
+            </w:tcMar>
+          </w:tcPr>
+          <w:p>
+            <w:pPr>
+              <w:spacing w:after="0" w:line="252"/>
+            </w:pPr>
+            <w:r>
+              <w:rPr>
+                <w:b w:val="false"/>
+                <w:bCs w:val="false"/>
+                <w:sz w:val="20"/>
+                <w:szCs w:val="20"/>
+              </w:rPr>
+              <w:t xml:space="preserve">94.5%</w:t>
+            </w:r>
+          </w:p>
+        </w:tc>
+        <w:tc>
+          <w:tcPr>
+            <w:tcW w:type="dxa" w:w="2938"/>
+            <w:tcBorders>
+              <w:top w:val="single" w:color="BFBFBF" w:sz="4"/>
+              <w:left w:val="single" w:color="BFBFBF" w:sz="4"/>
+              <w:bottom w:val="single" w:color="BFBFBF" w:sz="4"/>
+              <w:right w:val="single" w:color="BFBFBF" w:sz="4"/>
+            </w:tcBorders>
+            <w:tcMar>
+              <w:top w:type="dxa" w:w="70"/>
+              <w:left w:type="dxa" w:w="110"/>
+              <w:bottom w:type="dxa" w:w="70"/>
+              <w:right w:type="dxa" w:w="110"/>
+            </w:tcMar>
+          </w:tcPr>
+          <w:p>
+            <w:pPr>
+              <w:spacing w:after="0" w:line="252"/>
+            </w:pPr>
+            <w:r>
+              <w:rPr>
+                <w:b w:val="false"/>
+                <w:bCs w:val="false"/>
+                <w:sz w:val="20"/>
+                <w:szCs w:val="20"/>
+              </w:rPr>
+              <w:t xml:space="preserve">82.9%</w:t>
+            </w:r>
+          </w:p>
+        </w:tc>
+      </w:tr>
+      <w:tr>
+        <w:tc>
+          <w:tcPr>
+            <w:tcW w:type="dxa" w:w="4000"/>
+            <w:tcBorders>
+              <w:top w:val="single" w:color="BFBFBF" w:sz="4"/>
+              <w:left w:val="single" w:color="BFBFBF" w:sz="4"/>
+              <w:bottom w:val="single" w:color="BFBFBF" w:sz="4"/>
+              <w:right w:val="single" w:color="BFBFBF" w:sz="4"/>
+            </w:tcBorders>
+            <w:tcMar>
+              <w:top w:type="dxa" w:w="70"/>
+              <w:left w:type="dxa" w:w="110"/>
+              <w:bottom w:type="dxa" w:w="70"/>
+              <w:right w:type="dxa" w:w="110"/>
+            </w:tcMar>
+          </w:tcPr>
+          <w:p>
+            <w:pPr>
+              <w:spacing w:after="0" w:line="252"/>
+            </w:pPr>
+            <w:r>
+              <w:rPr>
+                <w:b w:val="false"/>
+                <w:bCs w:val="false"/>
+                <w:sz w:val="20"/>
+                <w:szCs w:val="20"/>
+              </w:rPr>
+              <w:t xml:space="preserve">Genuine items passed</w:t>
+            </w:r>
+          </w:p>
+        </w:tc>
+        <w:tc>
+          <w:tcPr>
+            <w:tcW w:type="dxa" w:w="2700"/>
+            <w:tcBorders>
+              <w:top w:val="single" w:color="BFBFBF" w:sz="4"/>
+              <w:left w:val="single" w:color="BFBFBF" w:sz="4"/>
+              <w:bottom w:val="single" w:color="BFBFBF" w:sz="4"/>
+              <w:right w:val="single" w:color="BFBFBF" w:sz="4"/>
+            </w:tcBorders>
+            <w:tcMar>
+              <w:top w:type="dxa" w:w="70"/>
+              <w:left w:type="dxa" w:w="110"/>
+              <w:bottom w:type="dxa" w:w="70"/>
+              <w:right w:type="dxa" w:w="110"/>
+            </w:tcMar>
+          </w:tcPr>
+          <w:p>
+            <w:pPr>
+              <w:spacing w:after="0" w:line="252"/>
+            </w:pPr>
+            <w:r>
+              <w:rPr>
+                <w:b w:val="false"/>
+                <w:bCs w:val="false"/>
+                <w:sz w:val="20"/>
+                <w:szCs w:val="20"/>
+              </w:rPr>
+              <w:t xml:space="preserve">95.3%</w:t>
+            </w:r>
+          </w:p>
+        </w:tc>
+        <w:tc>
+          <w:tcPr>
+            <w:tcW w:type="dxa" w:w="2938"/>
+            <w:tcBorders>
+              <w:top w:val="single" w:color="BFBFBF" w:sz="4"/>
+              <w:left w:val="single" w:color="BFBFBF" w:sz="4"/>
+              <w:bottom w:val="single" w:color="BFBFBF" w:sz="4"/>
+              <w:right w:val="single" w:color="BFBFBF" w:sz="4"/>
+            </w:tcBorders>
+            <w:tcMar>
+              <w:top w:type="dxa" w:w="70"/>
+              <w:left w:type="dxa" w:w="110"/>
+              <w:bottom w:type="dxa" w:w="70"/>
+              <w:right w:type="dxa" w:w="110"/>
+            </w:tcMar>
+          </w:tcPr>
+          <w:p>
+            <w:pPr>
+              <w:spacing w:after="0" w:line="252"/>
+            </w:pPr>
+            <w:r>
+              <w:rPr>
+                <w:b w:val="false"/>
+                <w:bCs w:val="false"/>
+                <w:sz w:val="20"/>
+                <w:szCs w:val="20"/>
+              </w:rPr>
+              <w:t xml:space="preserve">82.6%</w:t>
+            </w:r>
+          </w:p>
+        </w:tc>
+      </w:tr>
+      <w:tr>
+        <w:tc>
+          <w:tcPr>
+            <w:tcW w:type="dxa" w:w="4000"/>
+            <w:tcBorders>
+              <w:top w:val="single" w:color="BFBFBF" w:sz="4"/>
+              <w:left w:val="single" w:color="BFBFBF" w:sz="4"/>
+              <w:bottom w:val="single" w:color="BFBFBF" w:sz="4"/>
+              <w:right w:val="single" w:color="BFBFBF" w:sz="4"/>
+            </w:tcBorders>
+            <w:tcMar>
+              <w:top w:type="dxa" w:w="70"/>
+              <w:left w:type="dxa" w:w="110"/>
+              <w:bottom w:type="dxa" w:w="70"/>
+              <w:right w:type="dxa" w:w="110"/>
+            </w:tcMar>
+          </w:tcPr>
+          <w:p>
+            <w:pPr>
+              <w:spacing w:after="0" w:line="252"/>
+            </w:pPr>
+            <w:r>
+              <w:rPr>
+                <w:b w:val="false"/>
+                <w:bCs w:val="false"/>
+                <w:sz w:val="20"/>
+                <w:szCs w:val="20"/>
+              </w:rPr>
+              <w:t xml:space="preserve">Accuracy</w:t>
+            </w:r>
+          </w:p>
+        </w:tc>
+        <w:tc>
+          <w:tcPr>
+            <w:tcW w:type="dxa" w:w="2700"/>
+            <w:tcBorders>
+              <w:top w:val="single" w:color="BFBFBF" w:sz="4"/>
+              <w:left w:val="single" w:color="BFBFBF" w:sz="4"/>
+              <w:bottom w:val="single" w:color="BFBFBF" w:sz="4"/>
+              <w:right w:val="single" w:color="BFBFBF" w:sz="4"/>
+            </w:tcBorders>
+            <w:tcMar>
+              <w:top w:type="dxa" w:w="70"/>
+              <w:left w:type="dxa" w:w="110"/>
+              <w:bottom w:type="dxa" w:w="70"/>
+              <w:right w:type="dxa" w:w="110"/>
+            </w:tcMar>
+          </w:tcPr>
+          <w:p>
+            <w:pPr>
+              <w:spacing w:after="0" w:line="252"/>
+            </w:pPr>
+            <w:r>
+              <w:rPr>
+                <w:b w:val="false"/>
+                <w:bCs w:val="false"/>
+                <w:sz w:val="20"/>
+                <w:szCs w:val="20"/>
+              </w:rPr>
+              <w:t xml:space="preserve">88.3%</w:t>
+            </w:r>
+          </w:p>
+        </w:tc>
+        <w:tc>
+          <w:tcPr>
+            <w:tcW w:type="dxa" w:w="2938"/>
+            <w:tcBorders>
+              <w:top w:val="single" w:color="BFBFBF" w:sz="4"/>
+              <w:left w:val="single" w:color="BFBFBF" w:sz="4"/>
+              <w:bottom w:val="single" w:color="BFBFBF" w:sz="4"/>
+              <w:right w:val="single" w:color="BFBFBF" w:sz="4"/>
+            </w:tcBorders>
+            <w:tcMar>
+              <w:top w:type="dxa" w:w="70"/>
+              <w:left w:type="dxa" w:w="110"/>
+              <w:bottom w:type="dxa" w:w="70"/>
+              <w:right w:type="dxa" w:w="110"/>
+            </w:tcMar>
+          </w:tcPr>
+          <w:p>
+            <w:pPr>
+              <w:spacing w:after="0" w:line="252"/>
+            </w:pPr>
+            <w:r>
+              <w:rPr>
+                <w:b w:val="false"/>
+                <w:bCs w:val="false"/>
+                <w:sz w:val="20"/>
+                <w:szCs w:val="20"/>
+              </w:rPr>
+              <w:t xml:space="preserve">83.6%</w:t>
+            </w:r>
+          </w:p>
+        </w:tc>
+      </w:tr>
+      <w:tr>
+        <w:tc>
+          <w:tcPr>
+            <w:tcW w:type="dxa" w:w="4000"/>
+            <w:tcBorders>
+              <w:top w:val="single" w:color="BFBFBF" w:sz="4"/>
+              <w:left w:val="single" w:color="BFBFBF" w:sz="4"/>
+              <w:bottom w:val="single" w:color="BFBFBF" w:sz="4"/>
+              <w:right w:val="single" w:color="BFBFBF" w:sz="4"/>
+            </w:tcBorders>
+            <w:tcMar>
+              <w:top w:type="dxa" w:w="70"/>
+              <w:left w:type="dxa" w:w="110"/>
+              <w:bottom w:type="dxa" w:w="70"/>
+              <w:right w:type="dxa" w:w="110"/>
+            </w:tcMar>
+          </w:tcPr>
+          <w:p>
+            <w:pPr>
+              <w:spacing w:after="0" w:line="252"/>
+            </w:pPr>
+            <w:r>
+              <w:rPr>
+                <w:b w:val="false"/>
+                <w:bCs w:val="false"/>
+                <w:sz w:val="20"/>
+                <w:szCs w:val="20"/>
+              </w:rPr>
+              <w:t xml:space="preserve">ROC-AUC</w:t>
+            </w:r>
+          </w:p>
+        </w:tc>
+        <w:tc>
+          <w:tcPr>
+            <w:tcW w:type="dxa" w:w="2700"/>
+            <w:tcBorders>
+              <w:top w:val="single" w:color="BFBFBF" w:sz="4"/>
+              <w:left w:val="single" w:color="BFBFBF" w:sz="4"/>
+              <w:bottom w:val="single" w:color="BFBFBF" w:sz="4"/>
+              <w:right w:val="single" w:color="BFBFBF" w:sz="4"/>
+            </w:tcBorders>
+            <w:tcMar>
+              <w:top w:type="dxa" w:w="70"/>
+              <w:left w:type="dxa" w:w="110"/>
+              <w:bottom w:type="dxa" w:w="70"/>
+              <w:right w:type="dxa" w:w="110"/>
+            </w:tcMar>
+          </w:tcPr>
+          <w:p>
+            <w:pPr>
+              <w:spacing w:after="0" w:line="252"/>
+            </w:pPr>
+            <w:r>
+              <w:rPr>
+                <w:b w:val="false"/>
+                <w:bCs w:val="false"/>
+                <w:sz w:val="20"/>
+                <w:szCs w:val="20"/>
+              </w:rPr>
+              <w:t xml:space="preserve">0.909</w:t>
+            </w:r>
+          </w:p>
+        </w:tc>
+        <w:tc>
+          <w:tcPr>
+            <w:tcW w:type="dxa" w:w="2938"/>
+            <w:tcBorders>
+              <w:top w:val="single" w:color="BFBFBF" w:sz="4"/>
+              <w:left w:val="single" w:color="BFBFBF" w:sz="4"/>
+              <w:bottom w:val="single" w:color="BFBFBF" w:sz="4"/>
+              <w:right w:val="single" w:color="BFBFBF" w:sz="4"/>
+            </w:tcBorders>
+            <w:tcMar>
+              <w:top w:type="dxa" w:w="70"/>
+              <w:left w:type="dxa" w:w="110"/>
+              <w:bottom w:type="dxa" w:w="70"/>
+              <w:right w:type="dxa" w:w="110"/>
+            </w:tcMar>
+          </w:tcPr>
+          <w:p>
+            <w:pPr>
+              <w:spacing w:after="0" w:line="252"/>
+            </w:pPr>
+            <w:r>
+              <w:rPr>
+                <w:b w:val="false"/>
+                <w:bCs w:val="false"/>
+                <w:sz w:val="20"/>
+                <w:szCs w:val="20"/>
+              </w:rPr>
+              <w:t xml:space="preserve">0.904</w:t>
+            </w:r>
+          </w:p>
+        </w:tc>
+      </w:tr>
+      <w:tr>
+        <w:tc>
+          <w:tcPr>
+            <w:tcW w:type="dxa" w:w="4000"/>
+            <w:tcBorders>
+              <w:top w:val="single" w:color="BFBFBF" w:sz="4"/>
+              <w:left w:val="single" w:color="BFBFBF" w:sz="4"/>
+              <w:bottom w:val="single" w:color="BFBFBF" w:sz="4"/>
+              <w:right w:val="single" w:color="BFBFBF" w:sz="4"/>
+            </w:tcBorders>
+            <w:tcMar>
+              <w:top w:type="dxa" w:w="70"/>
+              <w:left w:type="dxa" w:w="110"/>
+              <w:bottom w:type="dxa" w:w="70"/>
+              <w:right w:type="dxa" w:w="110"/>
+            </w:tcMar>
+          </w:tcPr>
+          <w:p>
+            <w:pPr>
+              <w:spacing w:after="0" w:line="252"/>
+            </w:pPr>
+            <w:r>
+              <w:rPr>
+                <w:b w:val="false"/>
+                <w:bCs w:val="false"/>
+                <w:sz w:val="20"/>
+                <w:szCs w:val="20"/>
+              </w:rPr>
+              <w:t xml:space="preserve">Heatmap hottest point inside the real edit</w:t>
+            </w:r>
+          </w:p>
+        </w:tc>
+        <w:tc>
+          <w:tcPr>
+            <w:tcW w:type="dxa" w:w="2700"/>
+            <w:tcBorders>
+              <w:top w:val="single" w:color="BFBFBF" w:sz="4"/>
+              <w:left w:val="single" w:color="BFBFBF" w:sz="4"/>
+              <w:bottom w:val="single" w:color="BFBFBF" w:sz="4"/>
+              <w:right w:val="single" w:color="BFBFBF" w:sz="4"/>
+            </w:tcBorders>
+            <w:tcMar>
+              <w:top w:type="dxa" w:w="70"/>
+              <w:left w:type="dxa" w:w="110"/>
+              <w:bottom w:type="dxa" w:w="70"/>
+              <w:right w:type="dxa" w:w="110"/>
+            </w:tcMar>
+          </w:tcPr>
+          <w:p>
+            <w:pPr>
+              <w:spacing w:after="0" w:line="252"/>
+            </w:pPr>
+            <w:r>
+              <w:rPr>
+                <w:b w:val="false"/>
+                <w:bCs w:val="false"/>
+                <w:sz w:val="20"/>
+                <w:szCs w:val="20"/>
+              </w:rPr>
+              <w:t xml:space="preserve">49%</w:t>
+            </w:r>
+          </w:p>
+        </w:tc>
+        <w:tc>
+          <w:tcPr>
+            <w:tcW w:type="dxa" w:w="2938"/>
+            <w:tcBorders>
+              <w:top w:val="single" w:color="BFBFBF" w:sz="4"/>
+              <w:left w:val="single" w:color="BFBFBF" w:sz="4"/>
+              <w:bottom w:val="single" w:color="BFBFBF" w:sz="4"/>
+              <w:right w:val="single" w:color="BFBFBF" w:sz="4"/>
+            </w:tcBorders>
+            <w:tcMar>
+              <w:top w:type="dxa" w:w="70"/>
+              <w:left w:type="dxa" w:w="110"/>
+              <w:bottom w:type="dxa" w:w="70"/>
+              <w:right w:type="dxa" w:w="110"/>
+            </w:tcMar>
+          </w:tcPr>
+          <w:p>
+            <w:pPr>
+              <w:spacing w:after="0" w:line="252"/>
+            </w:pPr>
+            <w:r>
+              <w:rPr>
+                <w:b w:val="false"/>
+                <w:bCs w:val="false"/>
+                <w:sz w:val="20"/>
+                <w:szCs w:val="20"/>
+              </w:rPr>
+              <w:t xml:space="preserve">66% (after also choosing a sharper heatmap)</w:t>
+            </w:r>
+          </w:p>
+        </w:tc>
+      </w:tr>
+    </w:tbl>
+    <w:p>
+      <w:pPr>
+        <w:spacing w:after="120" w:line="276"/>
+      </w:pPr>
+      <w:r>
+        <w:t xml:space="preserve">Reading it honestly: the overall ranking quality (AUC) barely moved, so the model is not much worse. It just sits at a different balance, catching more fakes but raising more false alarms. Accuracy fell by about 5 points, which may be the part of the old score that came from the shortcut.</w:t>
       </w:r>
     </w:p>
     <w:p>
@@ -5454,7 +6351,71 @@
                 <w:sz w:val="20"/>
                 <w:szCs w:val="20"/>
               </w:rPr>
-              <w:t xml:space="preserve">Grad-CAM heatmaps.</w:t>
+              <w:t xml:space="preserve">Draws the heatmaps (Grad-CAM family) and loads the method chosen on validation data.</w:t>
+            </w:r>
+          </w:p>
+        </w:tc>
+      </w:tr>
+      <w:tr>
+        <w:tc>
+          <w:tcPr>
+            <w:tcW w:type="dxa" w:w="3300"/>
+            <w:tcBorders>
+              <w:top w:val="single" w:color="BFBFBF" w:sz="4"/>
+              <w:left w:val="single" w:color="BFBFBF" w:sz="4"/>
+              <w:bottom w:val="single" w:color="BFBFBF" w:sz="4"/>
+              <w:right w:val="single" w:color="BFBFBF" w:sz="4"/>
+            </w:tcBorders>
+            <w:tcMar>
+              <w:top w:type="dxa" w:w="70"/>
+              <w:left w:type="dxa" w:w="110"/>
+              <w:bottom w:type="dxa" w:w="70"/>
+              <w:right w:type="dxa" w:w="110"/>
+            </w:tcMar>
+          </w:tcPr>
+          <w:p>
+            <w:pPr>
+              <w:spacing w:after="0" w:line="252"/>
+            </w:pPr>
+            <w:r>
+              <w:rPr>
+                <w:b w:val="false"/>
+                <w:bCs w:val="false"/>
+                <w:sz w:val="20"/>
+                <w:szCs w:val="20"/>
+              </w:rPr>
+              <w:t xml:space="preserve">src/validate_explanations.py</w:t>
+            </w:r>
+          </w:p>
+        </w:tc>
+        <w:tc>
+          <w:tcPr>
+            <w:tcW w:type="dxa" w:w="6338"/>
+            <w:tcBorders>
+              <w:top w:val="single" w:color="BFBFBF" w:sz="4"/>
+              <w:left w:val="single" w:color="BFBFBF" w:sz="4"/>
+              <w:bottom w:val="single" w:color="BFBFBF" w:sz="4"/>
+              <w:right w:val="single" w:color="BFBFBF" w:sz="4"/>
+            </w:tcBorders>
+            <w:tcMar>
+              <w:top w:type="dxa" w:w="70"/>
+              <w:left w:type="dxa" w:w="110"/>
+              <w:bottom w:type="dxa" w:w="70"/>
+              <w:right w:type="dxa" w:w="110"/>
+            </w:tcMar>
+          </w:tcPr>
+          <w:p>
+            <w:pPr>
+              <w:spacing w:after="0" w:line="252"/>
+            </w:pPr>
+            <w:r>
+              <w:rPr>
+                <w:b w:val="false"/>
+                <w:bCs w:val="false"/>
+                <w:sz w:val="20"/>
+                <w:szCs w:val="20"/>
+              </w:rPr>
+              <w:t xml:space="preserve">Checks the heatmaps against the real edit locations, picks the best method, makes the example figures.</w:t>
             </w:r>
           </w:p>
         </w:tc>
@@ -5791,18 +6752,10 @@
           <w:b/>
           <w:bCs/>
         </w:rPr>
-        <w:t xml:space="preserve">The first model was too weak.</w:t>
-      </w:r>
-      <w:r>
-        <w:t xml:space="preserve"> Larger images and fine-tuning more layers fixed most of it. Lesson: judge on validation data, touch test data once.</w:t>
-      </w:r>
-    </w:p>
-    <w:p>
-      <w:pPr>
-        <w:pStyle w:val="Heading1"/>
-      </w:pPr>
-      <w:r>
-        <w:t xml:space="preserve">7. Limits you should say out loud</w:t>
+        <w:t xml:space="preserve">The model took a shortcut.</w:t>
+      </w:r>
+      <w:r>
+        <w:t xml:space="preserve"> It had learned to treat black wedges left by the shape-change edit as a sign of a fake. Found with the heatmap, fixed in the generator, retrained (section 4.10).</w:t>
       </w:r>
     </w:p>
     <w:p>
@@ -5819,10 +6772,18 @@
           <w:b/>
           <w:bCs/>
         </w:rPr>
-        <w:t xml:space="preserve">The fakes are simulated.</w:t>
-      </w:r>
-      <w:r>
-        <w:t xml:space="preserve"> The model has learned to spot our edits, not real counterfeiting methods. These scores are not real-world accuracy.</w:t>
+        <w:t xml:space="preserve">The first model was too weak.</w:t>
+      </w:r>
+      <w:r>
+        <w:t xml:space="preserve"> Larger images and fine-tuning more layers fixed most of it. Lesson: judge on validation data, touch test data once.</w:t>
+      </w:r>
+    </w:p>
+    <w:p>
+      <w:pPr>
+        <w:pStyle w:val="Heading1"/>
+      </w:pPr>
+      <w:r>
+        <w:t xml:space="preserve">7. Limits you should say out loud</w:t>
       </w:r>
     </w:p>
     <w:p>
@@ -5839,10 +6800,10 @@
           <w:b/>
           <w:bCs/>
         </w:rPr>
-        <w:t xml:space="preserve">Small data:</w:t>
-      </w:r>
-      <w:r>
-        <w:t xml:space="preserve"> 1,000 genuine images from two sources. Photos from other cameras, backgrounds or unfamiliar products may be misjudged; the model should answer "not sure" in such cases but is not guaranteed to.</w:t>
+        <w:t xml:space="preserve">The fakes are simulated.</w:t>
+      </w:r>
+      <w:r>
+        <w:t xml:space="preserve"> The model has learned to spot our edits, not real counterfeiting methods. These scores are not real-world accuracy.</w:t>
       </w:r>
     </w:p>
     <w:p>
@@ -5859,10 +6820,10 @@
           <w:b/>
           <w:bCs/>
         </w:rPr>
-        <w:t xml:space="preserve">A "genuine" verdict is not proof.</w:t>
-      </w:r>
-      <w:r>
-        <w:t xml:space="preserve"> Only lab chemistry can confirm a medicine.</w:t>
+        <w:t xml:space="preserve">Small data:</w:t>
+      </w:r>
+      <w:r>
+        <w:t xml:space="preserve"> 1,000 genuine images from two sources. Photos from other cameras, backgrounds or unfamiliar products may be misjudged; the model should answer "not sure" in such cases but is not guaranteed to.</w:t>
       </w:r>
     </w:p>
     <w:p>
@@ -5879,10 +6840,10 @@
           <w:b/>
           <w:bCs/>
         </w:rPr>
-        <w:t xml:space="preserve">Recall is 81%,</w:t>
-      </w:r>
-      <w:r>
-        <w:t xml:space="preserve"> below the 90% target. Subtle colour shifts are the main gap.</w:t>
+        <w:t xml:space="preserve">A "genuine" verdict is not proof.</w:t>
+      </w:r>
+      <w:r>
+        <w:t xml:space="preserve"> Only lab chemistry can confirm a medicine.</w:t>
       </w:r>
     </w:p>
     <w:p>
@@ -5899,6 +6860,26 @@
           <w:b/>
           <w:bCs/>
         </w:rPr>
+        <w:t xml:space="preserve">Fakes caught is 85%,</w:t>
+      </w:r>
+      <w:r>
+        <w:t xml:space="preserve"> below the 90% target, and about 17% of genuine items are wrongly flagged. Subtle colour shifts (78%) are the main gap.</w:t>
+      </w:r>
+    </w:p>
+    <w:p>
+      <w:pPr>
+        <w:pStyle w:val="ListParagraph"/>
+        <w:numPr>
+          <w:ilvl w:val="0"/>
+          <w:numId w:val="2"/>
+        </w:numPr>
+        <w:spacing w:after="60" w:line="276"/>
+      </w:pPr>
+      <w:r>
+        <w:rPr>
+          <w:b/>
+          <w:bCs/>
+        </w:rPr>
         <w:t xml:space="preserve">Drug naming</w:t>
       </w:r>
       <w:r>
@@ -5930,7 +6911,7 @@
         <w:t xml:space="preserve">Finish Phase 6:</w:t>
       </w:r>
       <w:r>
-        <w:t xml:space="preserve"> measure whether heatmaps point at the edited area, compare with LIME or SHAP, and pick 6 to 8 good and bad examples for the report.</w:t>
+        <w:t xml:space="preserve"> compare the heatmaps with LIME or SHAP (the heatmap checks and the example figures are already done).</w:t>
       </w:r>
     </w:p>
     <w:p>
@@ -6161,7 +7142,7 @@
         <w:spacing w:after="120" w:line="276"/>
       </w:pPr>
       <w:r>
-        <w:t xml:space="preserve">"We built an AI that looks at a photo of a medicine and says genuine, fake or not sure, shows a heatmap of why, and will log each decision on a blockchain so it cannot be edited later. Because real counterfeit data does not exist publicly, we trained on genuine photos and simulated fakes, and we tested on images it never saw. It catches about 81% of fakes with 94% precision; the blockchain part is the next phase."</w:t>
+        <w:t xml:space="preserve">"We built an AI that looks at a photo of a medicine and says genuine, fake or not sure, shows a heatmap of why, and will log each decision on a blockchain so it cannot be edited later. Because real counterfeit data does not exist publicly, we trained on genuine photos and simulated fakes, and we tested on images it never saw. It catches about 85% of fakes, with some false alarms (about 83% precision); the blockchain part is the next phase."</w:t>
       </w:r>
     </w:p>
     <w:p>
@@ -6871,7 +7852,7 @@
                 <w:sz w:val="20"/>
                 <w:szCs w:val="20"/>
               </w:rPr>
-              <w:t xml:space="preserve">Grad-CAM</w:t>
+              <w:t xml:space="preserve">Grad-CAM / LayerCAM</w:t>
             </w:r>
           </w:p>
         </w:tc>
@@ -6902,7 +7883,71 @@
                 <w:sz w:val="20"/>
                 <w:szCs w:val="20"/>
               </w:rPr>
-              <w:t xml:space="preserve">A heatmap showing which parts of the image drove the decision.</w:t>
+              <w:t xml:space="preserve">Heatmap methods showing which parts of the image drove the decision.</w:t>
+            </w:r>
+          </w:p>
+        </w:tc>
+      </w:tr>
+      <w:tr>
+        <w:tc>
+          <w:tcPr>
+            <w:tcW w:type="dxa" w:w="3000"/>
+            <w:tcBorders>
+              <w:top w:val="single" w:color="BFBFBF" w:sz="4"/>
+              <w:left w:val="single" w:color="BFBFBF" w:sz="4"/>
+              <w:bottom w:val="single" w:color="BFBFBF" w:sz="4"/>
+              <w:right w:val="single" w:color="BFBFBF" w:sz="4"/>
+            </w:tcBorders>
+            <w:tcMar>
+              <w:top w:type="dxa" w:w="70"/>
+              <w:left w:type="dxa" w:w="110"/>
+              <w:bottom w:type="dxa" w:w="70"/>
+              <w:right w:type="dxa" w:w="110"/>
+            </w:tcMar>
+          </w:tcPr>
+          <w:p>
+            <w:pPr>
+              <w:spacing w:after="0" w:line="252"/>
+            </w:pPr>
+            <w:r>
+              <w:rPr>
+                <w:b w:val="false"/>
+                <w:bCs w:val="false"/>
+                <w:sz w:val="20"/>
+                <w:szCs w:val="20"/>
+              </w:rPr>
+              <w:t xml:space="preserve">Shortcut learning</w:t>
+            </w:r>
+          </w:p>
+        </w:tc>
+        <w:tc>
+          <w:tcPr>
+            <w:tcW w:type="dxa" w:w="6638"/>
+            <w:tcBorders>
+              <w:top w:val="single" w:color="BFBFBF" w:sz="4"/>
+              <w:left w:val="single" w:color="BFBFBF" w:sz="4"/>
+              <w:bottom w:val="single" w:color="BFBFBF" w:sz="4"/>
+              <w:right w:val="single" w:color="BFBFBF" w:sz="4"/>
+            </w:tcBorders>
+            <w:tcMar>
+              <w:top w:type="dxa" w:w="70"/>
+              <w:left w:type="dxa" w:w="110"/>
+              <w:bottom w:type="dxa" w:w="70"/>
+              <w:right w:type="dxa" w:w="110"/>
+            </w:tcMar>
+          </w:tcPr>
+          <w:p>
+            <w:pPr>
+              <w:spacing w:after="0" w:line="252"/>
+            </w:pPr>
+            <w:r>
+              <w:rPr>
+                <w:b w:val="false"/>
+                <w:bCs w:val="false"/>
+                <w:sz w:val="20"/>
+                <w:szCs w:val="20"/>
+              </w:rPr>
+              <w:t xml:space="preserve">When a model passes a test by using an accidental clue (like a black corner) instead of the real signal.</w:t>
             </w:r>
           </w:p>
         </w:tc>

</xml_diff>